<commit_message>
Added and updated docs 11th may 26
</commit_message>
<xml_diff>
--- a/f16_rest_api_basics_flutter.docx
+++ b/f16_rest_api_basics_flutter.docx
@@ -824,6 +824,33 @@
           <w:szCs w:val="36"/>
         </w:rPr>
         <w:t>54</w:t>
+      </w:r>
+    </w:p>
+    <w:p>
+      <w:pPr>
+        <w:pStyle w:val="ListParagraph"/>
+        <w:numPr>
+          <w:ilvl w:val="0"/>
+          <w:numId w:val="10"/>
+        </w:numPr>
+        <w:rPr>
+          <w:sz w:val="36"/>
+          <w:szCs w:val="36"/>
+        </w:rPr>
+      </w:pPr>
+      <w:r>
+        <w:rPr>
+          <w:sz w:val="36"/>
+          <w:szCs w:val="36"/>
+        </w:rPr>
+        <w:t>Calling Multiple API End Points Parallelly</w:t>
+      </w:r>
+      <w:r>
+        <w:rPr>
+          <w:sz w:val="36"/>
+          <w:szCs w:val="36"/>
+        </w:rPr>
+        <w:t>…………….57</w:t>
       </w:r>
       <w:r>
         <w:rPr>
@@ -13477,25 +13504,7 @@
           <w:sz w:val="36"/>
           <w:szCs w:val="36"/>
         </w:rPr>
-        <w:t xml:space="preserve"> </w:t>
-      </w:r>
-      <w:r>
-        <w:rPr>
-          <w:b/>
-          <w:bCs/>
-          <w:sz w:val="36"/>
-          <w:szCs w:val="36"/>
-        </w:rPr>
-        <w:t>'POST'</w:t>
-      </w:r>
-      <w:r>
-        <w:rPr>
-          <w:b/>
-          <w:bCs/>
-          <w:sz w:val="36"/>
-          <w:szCs w:val="36"/>
-        </w:rPr>
-        <w:t xml:space="preserve"> </w:t>
+        <w:t xml:space="preserve"> 'POST' </w:t>
       </w:r>
       <w:r>
         <w:rPr>
@@ -14109,16 +14118,7 @@
           <w:sz w:val="36"/>
           <w:szCs w:val="36"/>
         </w:rPr>
-        <w:t>.</w:t>
-      </w:r>
-      <w:r>
-        <w:rPr>
-          <w:b/>
-          <w:bCs/>
-          <w:sz w:val="36"/>
-          <w:szCs w:val="36"/>
-        </w:rPr>
-        <w:t>fields</w:t>
+        <w:t>.fields</w:t>
       </w:r>
       <w:proofErr w:type="gramEnd"/>
       <w:r>
@@ -14222,25 +14222,7 @@
           <w:sz w:val="36"/>
           <w:szCs w:val="36"/>
         </w:rPr>
-        <w:t>[</w:t>
-      </w:r>
-      <w:r>
-        <w:rPr>
-          <w:b/>
-          <w:bCs/>
-          <w:sz w:val="36"/>
-          <w:szCs w:val="36"/>
-        </w:rPr>
-        <w:t>'name'</w:t>
-      </w:r>
-      <w:r>
-        <w:rPr>
-          <w:b/>
-          <w:bCs/>
-          <w:sz w:val="36"/>
-          <w:szCs w:val="36"/>
-        </w:rPr>
-        <w:t xml:space="preserve">] </w:t>
+        <w:t xml:space="preserve">['name'] </w:t>
       </w:r>
       <w:r>
         <w:rPr>
@@ -15086,25 +15068,7 @@
           <w:sz w:val="36"/>
           <w:szCs w:val="36"/>
         </w:rPr>
-        <w:t>'p</w:t>
-      </w:r>
-      <w:r>
-        <w:rPr>
-          <w:b/>
-          <w:bCs/>
-          <w:sz w:val="36"/>
-          <w:szCs w:val="36"/>
-        </w:rPr>
-        <w:t>hoto</w:t>
-      </w:r>
-      <w:r>
-        <w:rPr>
-          <w:b/>
-          <w:bCs/>
-          <w:sz w:val="36"/>
-          <w:szCs w:val="36"/>
-        </w:rPr>
-        <w:t>'</w:t>
+        <w:t>'photo'</w:t>
       </w:r>
       <w:r>
         <w:rPr>
@@ -17442,17 +17406,7 @@
           <w:sz w:val="36"/>
           <w:szCs w:val="36"/>
         </w:rPr>
-        <w:t>debugP</w:t>
-      </w:r>
-      <w:r>
-        <w:rPr>
-          <w:b/>
-          <w:bCs/>
-          <w:color w:val="D86DCB" w:themeColor="accent5" w:themeTint="99"/>
-          <w:sz w:val="36"/>
-          <w:szCs w:val="36"/>
-        </w:rPr>
-        <w:t>rint</w:t>
+        <w:t>debugPrint</w:t>
       </w:r>
       <w:proofErr w:type="spellEnd"/>
       <w:r>
@@ -17533,17 +17487,7 @@
           <w:sz w:val="36"/>
           <w:szCs w:val="36"/>
         </w:rPr>
-        <w:t>debugP</w:t>
-      </w:r>
-      <w:r>
-        <w:rPr>
-          <w:b/>
-          <w:bCs/>
-          <w:color w:val="D86DCB" w:themeColor="accent5" w:themeTint="99"/>
-          <w:sz w:val="36"/>
-          <w:szCs w:val="36"/>
-        </w:rPr>
-        <w:t>rint</w:t>
+        <w:t>debugPrint</w:t>
       </w:r>
       <w:proofErr w:type="spellEnd"/>
       <w:r>
@@ -19434,17 +19378,7 @@
           <w:sz w:val="36"/>
           <w:szCs w:val="36"/>
         </w:rPr>
-        <w:t xml:space="preserve">    </w:t>
-      </w:r>
-      <w:r>
-        <w:rPr>
-          <w:b/>
-          <w:bCs/>
-          <w:color w:val="D86DCB" w:themeColor="accent5" w:themeTint="99"/>
-          <w:sz w:val="36"/>
-          <w:szCs w:val="36"/>
-        </w:rPr>
-        <w:t>…</w:t>
+        <w:t xml:space="preserve">    …</w:t>
       </w:r>
     </w:p>
     <w:p>
@@ -43343,6 +43277,1958 @@
           <w:szCs w:val="36"/>
         </w:rPr>
       </w:pPr>
+    </w:p>
+    <w:p>
+      <w:pPr>
+        <w:jc w:val="both"/>
+        <w:rPr>
+          <w:b/>
+          <w:bCs/>
+          <w:sz w:val="36"/>
+          <w:szCs w:val="36"/>
+        </w:rPr>
+      </w:pPr>
+      <w:r>
+        <w:rPr>
+          <w:b/>
+          <w:bCs/>
+          <w:sz w:val="36"/>
+          <w:szCs w:val="36"/>
+        </w:rPr>
+        <w:t>Calling Multiple API End Points Parallelly:</w:t>
+      </w:r>
+    </w:p>
+    <w:p>
+      <w:pPr>
+        <w:jc w:val="both"/>
+        <w:rPr>
+          <w:sz w:val="36"/>
+          <w:szCs w:val="36"/>
+        </w:rPr>
+      </w:pPr>
+      <w:r>
+        <w:rPr>
+          <w:sz w:val="36"/>
+          <w:szCs w:val="36"/>
+        </w:rPr>
+        <w:t xml:space="preserve"># We can call multiple API end points parallelly, first parse URLs using </w:t>
+      </w:r>
+      <w:proofErr w:type="spellStart"/>
+      <w:r>
+        <w:rPr>
+          <w:b/>
+          <w:bCs/>
+          <w:sz w:val="36"/>
+          <w:szCs w:val="36"/>
+        </w:rPr>
+        <w:t>Uri.parse</w:t>
+      </w:r>
+      <w:proofErr w:type="spellEnd"/>
+      <w:r>
+        <w:rPr>
+          <w:b/>
+          <w:bCs/>
+          <w:sz w:val="36"/>
+          <w:szCs w:val="36"/>
+        </w:rPr>
+        <w:t>()</w:t>
+      </w:r>
+    </w:p>
+    <w:p>
+      <w:pPr>
+        <w:jc w:val="both"/>
+        <w:rPr>
+          <w:sz w:val="36"/>
+          <w:szCs w:val="36"/>
+        </w:rPr>
+      </w:pPr>
+      <w:r>
+        <w:rPr>
+          <w:sz w:val="36"/>
+          <w:szCs w:val="36"/>
+        </w:rPr>
+        <w:t xml:space="preserve"># Then fetch all of them at once parallelly using </w:t>
+      </w:r>
+      <w:proofErr w:type="spellStart"/>
+      <w:r>
+        <w:rPr>
+          <w:b/>
+          <w:bCs/>
+          <w:sz w:val="36"/>
+          <w:szCs w:val="36"/>
+        </w:rPr>
+        <w:t>Future.wait</w:t>
+      </w:r>
+      <w:proofErr w:type="spellEnd"/>
+      <w:r>
+        <w:rPr>
+          <w:b/>
+          <w:bCs/>
+          <w:sz w:val="36"/>
+          <w:szCs w:val="36"/>
+        </w:rPr>
+        <w:t xml:space="preserve">([…]) </w:t>
+      </w:r>
+      <w:r>
+        <w:rPr>
+          <w:sz w:val="36"/>
+          <w:szCs w:val="36"/>
+        </w:rPr>
+        <w:t xml:space="preserve">and </w:t>
+      </w:r>
+      <w:proofErr w:type="spellStart"/>
+      <w:proofErr w:type="gramStart"/>
+      <w:r>
+        <w:rPr>
+          <w:b/>
+          <w:bCs/>
+          <w:sz w:val="36"/>
+          <w:szCs w:val="36"/>
+        </w:rPr>
+        <w:t>http.get</w:t>
+      </w:r>
+      <w:proofErr w:type="spellEnd"/>
+      <w:r>
+        <w:rPr>
+          <w:b/>
+          <w:bCs/>
+          <w:sz w:val="36"/>
+          <w:szCs w:val="36"/>
+        </w:rPr>
+        <w:t>(</w:t>
+      </w:r>
+      <w:proofErr w:type="gramEnd"/>
+      <w:r>
+        <w:rPr>
+          <w:b/>
+          <w:bCs/>
+          <w:sz w:val="36"/>
+          <w:szCs w:val="36"/>
+        </w:rPr>
+        <w:t>)</w:t>
+      </w:r>
+      <w:r>
+        <w:rPr>
+          <w:sz w:val="36"/>
+          <w:szCs w:val="36"/>
+        </w:rPr>
+        <w:t xml:space="preserve"> method</w:t>
+      </w:r>
+    </w:p>
+    <w:p>
+      <w:pPr>
+        <w:jc w:val="both"/>
+        <w:rPr>
+          <w:b/>
+          <w:bCs/>
+          <w:sz w:val="36"/>
+          <w:szCs w:val="36"/>
+        </w:rPr>
+      </w:pPr>
+      <w:r>
+        <w:rPr>
+          <w:sz w:val="36"/>
+          <w:szCs w:val="36"/>
+        </w:rPr>
+        <w:t xml:space="preserve"># Once all of them are fetched, it will return a List of Response’s which we can use like this </w:t>
+      </w:r>
+      <w:proofErr w:type="spellStart"/>
+      <w:proofErr w:type="gramStart"/>
+      <w:r>
+        <w:rPr>
+          <w:b/>
+          <w:bCs/>
+          <w:sz w:val="36"/>
+          <w:szCs w:val="36"/>
+        </w:rPr>
+        <w:t>reponse</w:t>
+      </w:r>
+      <w:proofErr w:type="spellEnd"/>
+      <w:r>
+        <w:rPr>
+          <w:b/>
+          <w:bCs/>
+          <w:sz w:val="36"/>
+          <w:szCs w:val="36"/>
+        </w:rPr>
+        <w:t>[</w:t>
+      </w:r>
+      <w:proofErr w:type="gramEnd"/>
+      <w:r>
+        <w:rPr>
+          <w:b/>
+          <w:bCs/>
+          <w:sz w:val="36"/>
+          <w:szCs w:val="36"/>
+        </w:rPr>
+        <w:t>0].</w:t>
+      </w:r>
+      <w:proofErr w:type="spellStart"/>
+      <w:r>
+        <w:rPr>
+          <w:b/>
+          <w:bCs/>
+          <w:sz w:val="36"/>
+          <w:szCs w:val="36"/>
+        </w:rPr>
+        <w:t>statusCode</w:t>
+      </w:r>
+      <w:proofErr w:type="spellEnd"/>
+      <w:r>
+        <w:rPr>
+          <w:sz w:val="36"/>
+          <w:szCs w:val="36"/>
+        </w:rPr>
+        <w:t xml:space="preserve"> or </w:t>
+      </w:r>
+      <w:proofErr w:type="spellStart"/>
+      <w:r>
+        <w:rPr>
+          <w:b/>
+          <w:bCs/>
+          <w:sz w:val="36"/>
+          <w:szCs w:val="36"/>
+        </w:rPr>
+        <w:t>reponse</w:t>
+      </w:r>
+      <w:proofErr w:type="spellEnd"/>
+      <w:r>
+        <w:rPr>
+          <w:b/>
+          <w:bCs/>
+          <w:sz w:val="36"/>
+          <w:szCs w:val="36"/>
+        </w:rPr>
+        <w:t>[1].body</w:t>
+      </w:r>
+    </w:p>
+    <w:p>
+      <w:pPr>
+        <w:jc w:val="both"/>
+        <w:rPr>
+          <w:b/>
+          <w:bCs/>
+          <w:sz w:val="36"/>
+          <w:szCs w:val="36"/>
+        </w:rPr>
+      </w:pPr>
+      <w:r>
+        <w:rPr>
+          <w:sz w:val="36"/>
+          <w:szCs w:val="36"/>
+        </w:rPr>
+        <w:t xml:space="preserve"># We can also decode them separately like this </w:t>
+      </w:r>
+      <w:proofErr w:type="spellStart"/>
+      <w:r>
+        <w:rPr>
+          <w:b/>
+          <w:bCs/>
+          <w:sz w:val="36"/>
+          <w:szCs w:val="36"/>
+        </w:rPr>
+        <w:t>jsonDecode</w:t>
+      </w:r>
+      <w:proofErr w:type="spellEnd"/>
+      <w:r>
+        <w:rPr>
+          <w:b/>
+          <w:bCs/>
+          <w:sz w:val="36"/>
+          <w:szCs w:val="36"/>
+        </w:rPr>
+        <w:t>(response[0</w:t>
+      </w:r>
+      <w:proofErr w:type="gramStart"/>
+      <w:r>
+        <w:rPr>
+          <w:b/>
+          <w:bCs/>
+          <w:sz w:val="36"/>
+          <w:szCs w:val="36"/>
+        </w:rPr>
+        <w:t>].body</w:t>
+      </w:r>
+      <w:proofErr w:type="gramEnd"/>
+      <w:r>
+        <w:rPr>
+          <w:b/>
+          <w:bCs/>
+          <w:sz w:val="36"/>
+          <w:szCs w:val="36"/>
+        </w:rPr>
+        <w:t>)</w:t>
+      </w:r>
+    </w:p>
+    <w:p>
+      <w:pPr>
+        <w:jc w:val="both"/>
+        <w:rPr>
+          <w:sz w:val="36"/>
+          <w:szCs w:val="36"/>
+        </w:rPr>
+      </w:pPr>
+      <w:r>
+        <w:rPr>
+          <w:sz w:val="36"/>
+          <w:szCs w:val="36"/>
+        </w:rPr>
+        <w:t xml:space="preserve"># We can also merge them all into one structured object (for passing it to </w:t>
+      </w:r>
+      <w:proofErr w:type="gramStart"/>
+      <w:r>
+        <w:rPr>
+          <w:sz w:val="36"/>
+          <w:szCs w:val="36"/>
+        </w:rPr>
+        <w:t xml:space="preserve">models </w:t>
+      </w:r>
+      <w:r>
+        <w:rPr>
+          <w:b/>
+          <w:bCs/>
+          <w:sz w:val="36"/>
+          <w:szCs w:val="36"/>
+        </w:rPr>
+        <w:t>.</w:t>
+      </w:r>
+      <w:proofErr w:type="spellStart"/>
+      <w:r>
+        <w:rPr>
+          <w:b/>
+          <w:bCs/>
+          <w:sz w:val="36"/>
+          <w:szCs w:val="36"/>
+        </w:rPr>
+        <w:t>fromJson</w:t>
+      </w:r>
+      <w:proofErr w:type="spellEnd"/>
+      <w:proofErr w:type="gramEnd"/>
+      <w:r>
+        <w:rPr>
+          <w:b/>
+          <w:bCs/>
+          <w:sz w:val="36"/>
+          <w:szCs w:val="36"/>
+        </w:rPr>
+        <w:t>()</w:t>
+      </w:r>
+      <w:r>
+        <w:rPr>
+          <w:sz w:val="36"/>
+          <w:szCs w:val="36"/>
+        </w:rPr>
+        <w:t xml:space="preserve"> method) and implement more logic if we want </w:t>
+      </w:r>
+    </w:p>
+    <w:p>
+      <w:pPr>
+        <w:jc w:val="both"/>
+        <w:rPr>
+          <w:sz w:val="36"/>
+          <w:szCs w:val="36"/>
+        </w:rPr>
+      </w:pPr>
+      <w:r>
+        <w:rPr>
+          <w:sz w:val="36"/>
+          <w:szCs w:val="36"/>
+        </w:rPr>
+        <w:t># But it’s not good practice</w:t>
+      </w:r>
+    </w:p>
+    <w:p>
+      <w:pPr>
+        <w:jc w:val="both"/>
+        <w:rPr>
+          <w:b/>
+          <w:bCs/>
+          <w:color w:val="D86DCB" w:themeColor="accent5" w:themeTint="99"/>
+          <w:sz w:val="36"/>
+          <w:szCs w:val="36"/>
+        </w:rPr>
+      </w:pPr>
+      <w:r>
+        <w:rPr>
+          <w:b/>
+          <w:bCs/>
+          <w:color w:val="D86DCB" w:themeColor="accent5" w:themeTint="99"/>
+          <w:sz w:val="36"/>
+          <w:szCs w:val="36"/>
+        </w:rPr>
+        <w:t xml:space="preserve">final </w:t>
+      </w:r>
+      <w:proofErr w:type="spellStart"/>
+      <w:r>
+        <w:rPr>
+          <w:b/>
+          <w:bCs/>
+          <w:color w:val="D86DCB" w:themeColor="accent5" w:themeTint="99"/>
+          <w:sz w:val="36"/>
+          <w:szCs w:val="36"/>
+        </w:rPr>
+        <w:t>currentUrl</w:t>
+      </w:r>
+      <w:proofErr w:type="spellEnd"/>
+      <w:r>
+        <w:rPr>
+          <w:b/>
+          <w:bCs/>
+          <w:color w:val="D86DCB" w:themeColor="accent5" w:themeTint="99"/>
+          <w:sz w:val="36"/>
+          <w:szCs w:val="36"/>
+        </w:rPr>
+        <w:t xml:space="preserve"> = </w:t>
+      </w:r>
+      <w:proofErr w:type="spellStart"/>
+      <w:r>
+        <w:rPr>
+          <w:b/>
+          <w:bCs/>
+          <w:color w:val="D86DCB" w:themeColor="accent5" w:themeTint="99"/>
+          <w:sz w:val="36"/>
+          <w:szCs w:val="36"/>
+        </w:rPr>
+        <w:t>Uri.parse</w:t>
+      </w:r>
+      <w:proofErr w:type="spellEnd"/>
+      <w:r>
+        <w:rPr>
+          <w:b/>
+          <w:bCs/>
+          <w:color w:val="D86DCB" w:themeColor="accent5" w:themeTint="99"/>
+          <w:sz w:val="36"/>
+          <w:szCs w:val="36"/>
+        </w:rPr>
+        <w:t>(</w:t>
+      </w:r>
+    </w:p>
+    <w:p>
+      <w:pPr>
+        <w:jc w:val="both"/>
+        <w:rPr>
+          <w:b/>
+          <w:bCs/>
+          <w:color w:val="D86DCB" w:themeColor="accent5" w:themeTint="99"/>
+          <w:sz w:val="36"/>
+          <w:szCs w:val="36"/>
+        </w:rPr>
+      </w:pPr>
+      <w:r>
+        <w:rPr>
+          <w:b/>
+          <w:bCs/>
+          <w:color w:val="D86DCB" w:themeColor="accent5" w:themeTint="99"/>
+          <w:sz w:val="36"/>
+          <w:szCs w:val="36"/>
+        </w:rPr>
+        <w:lastRenderedPageBreak/>
+        <w:t xml:space="preserve">      'https://api.openweathermap.org/data/2.5/weather?lat=$lat&amp;lon=$lon&amp;units=metric&amp;appid=$apiKey',</w:t>
+      </w:r>
+    </w:p>
+    <w:p>
+      <w:pPr>
+        <w:jc w:val="both"/>
+        <w:rPr>
+          <w:b/>
+          <w:bCs/>
+          <w:color w:val="D86DCB" w:themeColor="accent5" w:themeTint="99"/>
+          <w:sz w:val="36"/>
+          <w:szCs w:val="36"/>
+        </w:rPr>
+      </w:pPr>
+      <w:r>
+        <w:rPr>
+          <w:b/>
+          <w:bCs/>
+          <w:color w:val="D86DCB" w:themeColor="accent5" w:themeTint="99"/>
+          <w:sz w:val="36"/>
+          <w:szCs w:val="36"/>
+        </w:rPr>
+        <w:t xml:space="preserve">    );</w:t>
+      </w:r>
+    </w:p>
+    <w:p>
+      <w:pPr>
+        <w:jc w:val="both"/>
+        <w:rPr>
+          <w:b/>
+          <w:bCs/>
+          <w:color w:val="D86DCB" w:themeColor="accent5" w:themeTint="99"/>
+          <w:sz w:val="36"/>
+          <w:szCs w:val="36"/>
+        </w:rPr>
+      </w:pPr>
+    </w:p>
+    <w:p>
+      <w:pPr>
+        <w:jc w:val="both"/>
+        <w:rPr>
+          <w:b/>
+          <w:bCs/>
+          <w:color w:val="D86DCB" w:themeColor="accent5" w:themeTint="99"/>
+          <w:sz w:val="36"/>
+          <w:szCs w:val="36"/>
+        </w:rPr>
+      </w:pPr>
+      <w:r>
+        <w:rPr>
+          <w:b/>
+          <w:bCs/>
+          <w:color w:val="D86DCB" w:themeColor="accent5" w:themeTint="99"/>
+          <w:sz w:val="36"/>
+          <w:szCs w:val="36"/>
+        </w:rPr>
+        <w:t xml:space="preserve">    final </w:t>
+      </w:r>
+      <w:proofErr w:type="spellStart"/>
+      <w:r>
+        <w:rPr>
+          <w:b/>
+          <w:bCs/>
+          <w:color w:val="D86DCB" w:themeColor="accent5" w:themeTint="99"/>
+          <w:sz w:val="36"/>
+          <w:szCs w:val="36"/>
+        </w:rPr>
+        <w:t>hourlyUrl</w:t>
+      </w:r>
+      <w:proofErr w:type="spellEnd"/>
+      <w:r>
+        <w:rPr>
+          <w:b/>
+          <w:bCs/>
+          <w:color w:val="D86DCB" w:themeColor="accent5" w:themeTint="99"/>
+          <w:sz w:val="36"/>
+          <w:szCs w:val="36"/>
+        </w:rPr>
+        <w:t xml:space="preserve"> = </w:t>
+      </w:r>
+      <w:proofErr w:type="spellStart"/>
+      <w:r>
+        <w:rPr>
+          <w:b/>
+          <w:bCs/>
+          <w:color w:val="D86DCB" w:themeColor="accent5" w:themeTint="99"/>
+          <w:sz w:val="36"/>
+          <w:szCs w:val="36"/>
+        </w:rPr>
+        <w:t>Uri.parse</w:t>
+      </w:r>
+      <w:proofErr w:type="spellEnd"/>
+      <w:r>
+        <w:rPr>
+          <w:b/>
+          <w:bCs/>
+          <w:color w:val="D86DCB" w:themeColor="accent5" w:themeTint="99"/>
+          <w:sz w:val="36"/>
+          <w:szCs w:val="36"/>
+        </w:rPr>
+        <w:t>(</w:t>
+      </w:r>
+    </w:p>
+    <w:p>
+      <w:pPr>
+        <w:jc w:val="both"/>
+        <w:rPr>
+          <w:b/>
+          <w:bCs/>
+          <w:color w:val="D86DCB" w:themeColor="accent5" w:themeTint="99"/>
+          <w:sz w:val="36"/>
+          <w:szCs w:val="36"/>
+        </w:rPr>
+      </w:pPr>
+      <w:r>
+        <w:rPr>
+          <w:b/>
+          <w:bCs/>
+          <w:color w:val="D86DCB" w:themeColor="accent5" w:themeTint="99"/>
+          <w:sz w:val="36"/>
+          <w:szCs w:val="36"/>
+        </w:rPr>
+        <w:t>'https://pro.openweathermap.org/data/2.5/forecast/hourly?lat=$lat&amp;lon=$lon&amp;units=metric&amp;appid=$apiKey&amp;cnt=24',</w:t>
+      </w:r>
+    </w:p>
+    <w:p>
+      <w:pPr>
+        <w:jc w:val="both"/>
+        <w:rPr>
+          <w:b/>
+          <w:bCs/>
+          <w:color w:val="D86DCB" w:themeColor="accent5" w:themeTint="99"/>
+          <w:sz w:val="36"/>
+          <w:szCs w:val="36"/>
+        </w:rPr>
+      </w:pPr>
+      <w:r>
+        <w:rPr>
+          <w:b/>
+          <w:bCs/>
+          <w:color w:val="D86DCB" w:themeColor="accent5" w:themeTint="99"/>
+          <w:sz w:val="36"/>
+          <w:szCs w:val="36"/>
+        </w:rPr>
+        <w:t xml:space="preserve">    );</w:t>
+      </w:r>
+    </w:p>
+    <w:p>
+      <w:pPr>
+        <w:jc w:val="both"/>
+        <w:rPr>
+          <w:b/>
+          <w:bCs/>
+          <w:color w:val="D86DCB" w:themeColor="accent5" w:themeTint="99"/>
+          <w:sz w:val="36"/>
+          <w:szCs w:val="36"/>
+        </w:rPr>
+      </w:pPr>
+    </w:p>
+    <w:p>
+      <w:pPr>
+        <w:jc w:val="both"/>
+        <w:rPr>
+          <w:b/>
+          <w:bCs/>
+          <w:color w:val="D86DCB" w:themeColor="accent5" w:themeTint="99"/>
+          <w:sz w:val="36"/>
+          <w:szCs w:val="36"/>
+        </w:rPr>
+      </w:pPr>
+      <w:r>
+        <w:rPr>
+          <w:b/>
+          <w:bCs/>
+          <w:color w:val="D86DCB" w:themeColor="accent5" w:themeTint="99"/>
+          <w:sz w:val="36"/>
+          <w:szCs w:val="36"/>
+        </w:rPr>
+        <w:t xml:space="preserve">    final </w:t>
+      </w:r>
+      <w:proofErr w:type="spellStart"/>
+      <w:r>
+        <w:rPr>
+          <w:b/>
+          <w:bCs/>
+          <w:color w:val="D86DCB" w:themeColor="accent5" w:themeTint="99"/>
+          <w:sz w:val="36"/>
+          <w:szCs w:val="36"/>
+        </w:rPr>
+        <w:t>dailyUrl</w:t>
+      </w:r>
+      <w:proofErr w:type="spellEnd"/>
+      <w:r>
+        <w:rPr>
+          <w:b/>
+          <w:bCs/>
+          <w:color w:val="D86DCB" w:themeColor="accent5" w:themeTint="99"/>
+          <w:sz w:val="36"/>
+          <w:szCs w:val="36"/>
+        </w:rPr>
+        <w:t xml:space="preserve"> = </w:t>
+      </w:r>
+      <w:proofErr w:type="spellStart"/>
+      <w:r>
+        <w:rPr>
+          <w:b/>
+          <w:bCs/>
+          <w:color w:val="D86DCB" w:themeColor="accent5" w:themeTint="99"/>
+          <w:sz w:val="36"/>
+          <w:szCs w:val="36"/>
+        </w:rPr>
+        <w:t>Uri.parse</w:t>
+      </w:r>
+      <w:proofErr w:type="spellEnd"/>
+      <w:r>
+        <w:rPr>
+          <w:b/>
+          <w:bCs/>
+          <w:color w:val="D86DCB" w:themeColor="accent5" w:themeTint="99"/>
+          <w:sz w:val="36"/>
+          <w:szCs w:val="36"/>
+        </w:rPr>
+        <w:t>(</w:t>
+      </w:r>
+    </w:p>
+    <w:p>
+      <w:pPr>
+        <w:jc w:val="both"/>
+        <w:rPr>
+          <w:b/>
+          <w:bCs/>
+          <w:color w:val="D86DCB" w:themeColor="accent5" w:themeTint="99"/>
+          <w:sz w:val="36"/>
+          <w:szCs w:val="36"/>
+        </w:rPr>
+      </w:pPr>
+      <w:r>
+        <w:rPr>
+          <w:b/>
+          <w:bCs/>
+          <w:color w:val="D86DCB" w:themeColor="accent5" w:themeTint="99"/>
+          <w:sz w:val="36"/>
+          <w:szCs w:val="36"/>
+        </w:rPr>
+        <w:t>'https://pro.openweathermap.org/data/2.5/forecast/daily?lat=$lat&amp;lon=$lon&amp;cnt=7&amp;units=metric&amp;appid=$apiKey',</w:t>
+      </w:r>
+    </w:p>
+    <w:p>
+      <w:pPr>
+        <w:jc w:val="both"/>
+        <w:rPr>
+          <w:b/>
+          <w:bCs/>
+          <w:color w:val="D86DCB" w:themeColor="accent5" w:themeTint="99"/>
+          <w:sz w:val="36"/>
+          <w:szCs w:val="36"/>
+        </w:rPr>
+      </w:pPr>
+      <w:r>
+        <w:rPr>
+          <w:b/>
+          <w:bCs/>
+          <w:color w:val="D86DCB" w:themeColor="accent5" w:themeTint="99"/>
+          <w:sz w:val="36"/>
+          <w:szCs w:val="36"/>
+        </w:rPr>
+        <w:t xml:space="preserve">    );</w:t>
+      </w:r>
+    </w:p>
+    <w:p>
+      <w:pPr>
+        <w:jc w:val="both"/>
+        <w:rPr>
+          <w:b/>
+          <w:bCs/>
+          <w:color w:val="D86DCB" w:themeColor="accent5" w:themeTint="99"/>
+          <w:sz w:val="36"/>
+          <w:szCs w:val="36"/>
+        </w:rPr>
+      </w:pPr>
+    </w:p>
+    <w:p>
+      <w:pPr>
+        <w:jc w:val="both"/>
+        <w:rPr>
+          <w:b/>
+          <w:bCs/>
+          <w:color w:val="D86DCB" w:themeColor="accent5" w:themeTint="99"/>
+          <w:sz w:val="36"/>
+          <w:szCs w:val="36"/>
+        </w:rPr>
+      </w:pPr>
+      <w:r>
+        <w:rPr>
+          <w:b/>
+          <w:bCs/>
+          <w:color w:val="D86DCB" w:themeColor="accent5" w:themeTint="99"/>
+          <w:sz w:val="36"/>
+          <w:szCs w:val="36"/>
+        </w:rPr>
+        <w:t xml:space="preserve">    try {</w:t>
+      </w:r>
+    </w:p>
+    <w:p>
+      <w:pPr>
+        <w:jc w:val="both"/>
+        <w:rPr>
+          <w:b/>
+          <w:bCs/>
+          <w:color w:val="D86DCB" w:themeColor="accent5" w:themeTint="99"/>
+          <w:sz w:val="36"/>
+          <w:szCs w:val="36"/>
+        </w:rPr>
+      </w:pPr>
+      <w:r>
+        <w:rPr>
+          <w:b/>
+          <w:bCs/>
+          <w:color w:val="D86DCB" w:themeColor="accent5" w:themeTint="99"/>
+          <w:sz w:val="36"/>
+          <w:szCs w:val="36"/>
+        </w:rPr>
+        <w:t xml:space="preserve">      // Fetch all in parallel</w:t>
+      </w:r>
+    </w:p>
+    <w:p>
+      <w:pPr>
+        <w:jc w:val="both"/>
+        <w:rPr>
+          <w:b/>
+          <w:bCs/>
+          <w:color w:val="D86DCB" w:themeColor="accent5" w:themeTint="99"/>
+          <w:sz w:val="36"/>
+          <w:szCs w:val="36"/>
+        </w:rPr>
+      </w:pPr>
+      <w:r>
+        <w:rPr>
+          <w:b/>
+          <w:bCs/>
+          <w:color w:val="D86DCB" w:themeColor="accent5" w:themeTint="99"/>
+          <w:sz w:val="36"/>
+          <w:szCs w:val="36"/>
+        </w:rPr>
+        <w:t xml:space="preserve">      </w:t>
+      </w:r>
+      <w:r>
+        <w:rPr>
+          <w:b/>
+          <w:bCs/>
+          <w:color w:val="D86DCB" w:themeColor="accent5" w:themeTint="99"/>
+          <w:sz w:val="36"/>
+          <w:szCs w:val="36"/>
+        </w:rPr>
+        <w:t>F</w:t>
+      </w:r>
+      <w:r>
+        <w:rPr>
+          <w:b/>
+          <w:bCs/>
+          <w:color w:val="D86DCB" w:themeColor="accent5" w:themeTint="99"/>
+          <w:sz w:val="36"/>
+          <w:szCs w:val="36"/>
+        </w:rPr>
+        <w:t>inal</w:t>
+      </w:r>
+      <w:r>
+        <w:rPr>
+          <w:b/>
+          <w:bCs/>
+          <w:color w:val="D86DCB" w:themeColor="accent5" w:themeTint="99"/>
+          <w:sz w:val="36"/>
+          <w:szCs w:val="36"/>
+        </w:rPr>
+        <w:t xml:space="preserve"> List&lt;</w:t>
+      </w:r>
+      <w:proofErr w:type="spellStart"/>
+      <w:r>
+        <w:rPr>
+          <w:b/>
+          <w:bCs/>
+          <w:color w:val="D86DCB" w:themeColor="accent5" w:themeTint="99"/>
+          <w:sz w:val="36"/>
+          <w:szCs w:val="36"/>
+        </w:rPr>
+        <w:t>http.Respose</w:t>
+      </w:r>
+      <w:proofErr w:type="spellEnd"/>
+      <w:r>
+        <w:rPr>
+          <w:b/>
+          <w:bCs/>
+          <w:color w:val="D86DCB" w:themeColor="accent5" w:themeTint="99"/>
+          <w:sz w:val="36"/>
+          <w:szCs w:val="36"/>
+        </w:rPr>
+        <w:t>&gt;</w:t>
+      </w:r>
+      <w:r>
+        <w:rPr>
+          <w:b/>
+          <w:bCs/>
+          <w:color w:val="D86DCB" w:themeColor="accent5" w:themeTint="99"/>
+          <w:sz w:val="36"/>
+          <w:szCs w:val="36"/>
+        </w:rPr>
+        <w:t xml:space="preserve"> response = await </w:t>
+      </w:r>
+      <w:proofErr w:type="spellStart"/>
+      <w:r>
+        <w:rPr>
+          <w:b/>
+          <w:bCs/>
+          <w:color w:val="D86DCB" w:themeColor="accent5" w:themeTint="99"/>
+          <w:sz w:val="36"/>
+          <w:szCs w:val="36"/>
+        </w:rPr>
+        <w:t>Future.wait</w:t>
+      </w:r>
+      <w:proofErr w:type="spellEnd"/>
+      <w:r>
+        <w:rPr>
+          <w:b/>
+          <w:bCs/>
+          <w:color w:val="D86DCB" w:themeColor="accent5" w:themeTint="99"/>
+          <w:sz w:val="36"/>
+          <w:szCs w:val="36"/>
+        </w:rPr>
+        <w:t>([</w:t>
+      </w:r>
+    </w:p>
+    <w:p>
+      <w:pPr>
+        <w:jc w:val="both"/>
+        <w:rPr>
+          <w:b/>
+          <w:bCs/>
+          <w:color w:val="D86DCB" w:themeColor="accent5" w:themeTint="99"/>
+          <w:sz w:val="36"/>
+          <w:szCs w:val="36"/>
+        </w:rPr>
+      </w:pPr>
+      <w:r>
+        <w:rPr>
+          <w:b/>
+          <w:bCs/>
+          <w:color w:val="D86DCB" w:themeColor="accent5" w:themeTint="99"/>
+          <w:sz w:val="36"/>
+          <w:szCs w:val="36"/>
+        </w:rPr>
+        <w:t xml:space="preserve">        </w:t>
+      </w:r>
+      <w:proofErr w:type="spellStart"/>
+      <w:r>
+        <w:rPr>
+          <w:b/>
+          <w:bCs/>
+          <w:color w:val="D86DCB" w:themeColor="accent5" w:themeTint="99"/>
+          <w:sz w:val="36"/>
+          <w:szCs w:val="36"/>
+        </w:rPr>
+        <w:t>http.get</w:t>
+      </w:r>
+      <w:proofErr w:type="spellEnd"/>
+      <w:r>
+        <w:rPr>
+          <w:b/>
+          <w:bCs/>
+          <w:color w:val="D86DCB" w:themeColor="accent5" w:themeTint="99"/>
+          <w:sz w:val="36"/>
+          <w:szCs w:val="36"/>
+        </w:rPr>
+        <w:t>(</w:t>
+      </w:r>
+      <w:proofErr w:type="spellStart"/>
+      <w:r>
+        <w:rPr>
+          <w:b/>
+          <w:bCs/>
+          <w:color w:val="D86DCB" w:themeColor="accent5" w:themeTint="99"/>
+          <w:sz w:val="36"/>
+          <w:szCs w:val="36"/>
+        </w:rPr>
+        <w:t>currentUrl</w:t>
+      </w:r>
+      <w:proofErr w:type="spellEnd"/>
+      <w:r>
+        <w:rPr>
+          <w:b/>
+          <w:bCs/>
+          <w:color w:val="D86DCB" w:themeColor="accent5" w:themeTint="99"/>
+          <w:sz w:val="36"/>
+          <w:szCs w:val="36"/>
+        </w:rPr>
+        <w:t>),</w:t>
+      </w:r>
+    </w:p>
+    <w:p>
+      <w:pPr>
+        <w:jc w:val="both"/>
+        <w:rPr>
+          <w:b/>
+          <w:bCs/>
+          <w:color w:val="D86DCB" w:themeColor="accent5" w:themeTint="99"/>
+          <w:sz w:val="36"/>
+          <w:szCs w:val="36"/>
+        </w:rPr>
+      </w:pPr>
+      <w:r>
+        <w:rPr>
+          <w:b/>
+          <w:bCs/>
+          <w:color w:val="D86DCB" w:themeColor="accent5" w:themeTint="99"/>
+          <w:sz w:val="36"/>
+          <w:szCs w:val="36"/>
+        </w:rPr>
+        <w:lastRenderedPageBreak/>
+        <w:t xml:space="preserve">        </w:t>
+      </w:r>
+      <w:proofErr w:type="spellStart"/>
+      <w:r>
+        <w:rPr>
+          <w:b/>
+          <w:bCs/>
+          <w:color w:val="D86DCB" w:themeColor="accent5" w:themeTint="99"/>
+          <w:sz w:val="36"/>
+          <w:szCs w:val="36"/>
+        </w:rPr>
+        <w:t>http.get</w:t>
+      </w:r>
+      <w:proofErr w:type="spellEnd"/>
+      <w:r>
+        <w:rPr>
+          <w:b/>
+          <w:bCs/>
+          <w:color w:val="D86DCB" w:themeColor="accent5" w:themeTint="99"/>
+          <w:sz w:val="36"/>
+          <w:szCs w:val="36"/>
+        </w:rPr>
+        <w:t>(</w:t>
+      </w:r>
+      <w:proofErr w:type="spellStart"/>
+      <w:r>
+        <w:rPr>
+          <w:b/>
+          <w:bCs/>
+          <w:color w:val="D86DCB" w:themeColor="accent5" w:themeTint="99"/>
+          <w:sz w:val="36"/>
+          <w:szCs w:val="36"/>
+        </w:rPr>
+        <w:t>hourlyUrl</w:t>
+      </w:r>
+      <w:proofErr w:type="spellEnd"/>
+      <w:r>
+        <w:rPr>
+          <w:b/>
+          <w:bCs/>
+          <w:color w:val="D86DCB" w:themeColor="accent5" w:themeTint="99"/>
+          <w:sz w:val="36"/>
+          <w:szCs w:val="36"/>
+        </w:rPr>
+        <w:t>),</w:t>
+      </w:r>
+    </w:p>
+    <w:p>
+      <w:pPr>
+        <w:jc w:val="both"/>
+        <w:rPr>
+          <w:b/>
+          <w:bCs/>
+          <w:color w:val="D86DCB" w:themeColor="accent5" w:themeTint="99"/>
+          <w:sz w:val="36"/>
+          <w:szCs w:val="36"/>
+        </w:rPr>
+      </w:pPr>
+      <w:r>
+        <w:rPr>
+          <w:b/>
+          <w:bCs/>
+          <w:color w:val="D86DCB" w:themeColor="accent5" w:themeTint="99"/>
+          <w:sz w:val="36"/>
+          <w:szCs w:val="36"/>
+        </w:rPr>
+        <w:t xml:space="preserve">        </w:t>
+      </w:r>
+      <w:proofErr w:type="spellStart"/>
+      <w:r>
+        <w:rPr>
+          <w:b/>
+          <w:bCs/>
+          <w:color w:val="D86DCB" w:themeColor="accent5" w:themeTint="99"/>
+          <w:sz w:val="36"/>
+          <w:szCs w:val="36"/>
+        </w:rPr>
+        <w:t>http.get</w:t>
+      </w:r>
+      <w:proofErr w:type="spellEnd"/>
+      <w:r>
+        <w:rPr>
+          <w:b/>
+          <w:bCs/>
+          <w:color w:val="D86DCB" w:themeColor="accent5" w:themeTint="99"/>
+          <w:sz w:val="36"/>
+          <w:szCs w:val="36"/>
+        </w:rPr>
+        <w:t>(</w:t>
+      </w:r>
+      <w:proofErr w:type="spellStart"/>
+      <w:r>
+        <w:rPr>
+          <w:b/>
+          <w:bCs/>
+          <w:color w:val="D86DCB" w:themeColor="accent5" w:themeTint="99"/>
+          <w:sz w:val="36"/>
+          <w:szCs w:val="36"/>
+        </w:rPr>
+        <w:t>dailyUrl</w:t>
+      </w:r>
+      <w:proofErr w:type="spellEnd"/>
+      <w:r>
+        <w:rPr>
+          <w:b/>
+          <w:bCs/>
+          <w:color w:val="D86DCB" w:themeColor="accent5" w:themeTint="99"/>
+          <w:sz w:val="36"/>
+          <w:szCs w:val="36"/>
+        </w:rPr>
+        <w:t>),</w:t>
+      </w:r>
+    </w:p>
+    <w:p>
+      <w:pPr>
+        <w:jc w:val="both"/>
+        <w:rPr>
+          <w:b/>
+          <w:bCs/>
+          <w:color w:val="D86DCB" w:themeColor="accent5" w:themeTint="99"/>
+          <w:sz w:val="36"/>
+          <w:szCs w:val="36"/>
+        </w:rPr>
+      </w:pPr>
+      <w:r>
+        <w:rPr>
+          <w:b/>
+          <w:bCs/>
+          <w:color w:val="D86DCB" w:themeColor="accent5" w:themeTint="99"/>
+          <w:sz w:val="36"/>
+          <w:szCs w:val="36"/>
+        </w:rPr>
+        <w:t xml:space="preserve">      ]);</w:t>
+      </w:r>
+    </w:p>
+    <w:p>
+      <w:pPr>
+        <w:jc w:val="both"/>
+        <w:rPr>
+          <w:b/>
+          <w:bCs/>
+          <w:color w:val="D86DCB" w:themeColor="accent5" w:themeTint="99"/>
+          <w:sz w:val="36"/>
+          <w:szCs w:val="36"/>
+        </w:rPr>
+      </w:pPr>
+    </w:p>
+    <w:p>
+      <w:pPr>
+        <w:jc w:val="both"/>
+        <w:rPr>
+          <w:b/>
+          <w:bCs/>
+          <w:color w:val="D86DCB" w:themeColor="accent5" w:themeTint="99"/>
+          <w:sz w:val="36"/>
+          <w:szCs w:val="36"/>
+        </w:rPr>
+      </w:pPr>
+      <w:r>
+        <w:rPr>
+          <w:b/>
+          <w:bCs/>
+          <w:color w:val="D86DCB" w:themeColor="accent5" w:themeTint="99"/>
+          <w:sz w:val="36"/>
+          <w:szCs w:val="36"/>
+        </w:rPr>
+        <w:t xml:space="preserve">      // Checks if the server’s response code is 200, which means success.</w:t>
+      </w:r>
+    </w:p>
+    <w:p>
+      <w:pPr>
+        <w:jc w:val="both"/>
+        <w:rPr>
+          <w:b/>
+          <w:bCs/>
+          <w:color w:val="D86DCB" w:themeColor="accent5" w:themeTint="99"/>
+          <w:sz w:val="36"/>
+          <w:szCs w:val="36"/>
+        </w:rPr>
+      </w:pPr>
+      <w:r>
+        <w:rPr>
+          <w:b/>
+          <w:bCs/>
+          <w:color w:val="D86DCB" w:themeColor="accent5" w:themeTint="99"/>
+          <w:sz w:val="36"/>
+          <w:szCs w:val="36"/>
+        </w:rPr>
+        <w:t xml:space="preserve">      if (</w:t>
+      </w:r>
+      <w:proofErr w:type="gramStart"/>
+      <w:r>
+        <w:rPr>
+          <w:b/>
+          <w:bCs/>
+          <w:color w:val="D86DCB" w:themeColor="accent5" w:themeTint="99"/>
+          <w:sz w:val="36"/>
+          <w:szCs w:val="36"/>
+        </w:rPr>
+        <w:t>response[</w:t>
+      </w:r>
+      <w:proofErr w:type="gramEnd"/>
+      <w:r>
+        <w:rPr>
+          <w:b/>
+          <w:bCs/>
+          <w:color w:val="D86DCB" w:themeColor="accent5" w:themeTint="99"/>
+          <w:sz w:val="36"/>
+          <w:szCs w:val="36"/>
+        </w:rPr>
+        <w:t>2].</w:t>
+      </w:r>
+      <w:proofErr w:type="spellStart"/>
+      <w:r>
+        <w:rPr>
+          <w:b/>
+          <w:bCs/>
+          <w:color w:val="D86DCB" w:themeColor="accent5" w:themeTint="99"/>
+          <w:sz w:val="36"/>
+          <w:szCs w:val="36"/>
+        </w:rPr>
+        <w:t>statusCode</w:t>
+      </w:r>
+      <w:proofErr w:type="spellEnd"/>
+      <w:r>
+        <w:rPr>
+          <w:b/>
+          <w:bCs/>
+          <w:color w:val="D86DCB" w:themeColor="accent5" w:themeTint="99"/>
+          <w:sz w:val="36"/>
+          <w:szCs w:val="36"/>
+        </w:rPr>
+        <w:t xml:space="preserve"> == 200) {</w:t>
+      </w:r>
+    </w:p>
+    <w:p>
+      <w:pPr>
+        <w:jc w:val="both"/>
+        <w:rPr>
+          <w:b/>
+          <w:bCs/>
+          <w:color w:val="D86DCB" w:themeColor="accent5" w:themeTint="99"/>
+          <w:sz w:val="36"/>
+          <w:szCs w:val="36"/>
+        </w:rPr>
+      </w:pPr>
+      <w:r>
+        <w:rPr>
+          <w:b/>
+          <w:bCs/>
+          <w:color w:val="D86DCB" w:themeColor="accent5" w:themeTint="99"/>
+          <w:sz w:val="36"/>
+          <w:szCs w:val="36"/>
+        </w:rPr>
+        <w:t xml:space="preserve">        // </w:t>
+      </w:r>
+      <w:proofErr w:type="gramStart"/>
+      <w:r>
+        <w:rPr>
+          <w:b/>
+          <w:bCs/>
+          <w:color w:val="D86DCB" w:themeColor="accent5" w:themeTint="99"/>
+          <w:sz w:val="36"/>
+          <w:szCs w:val="36"/>
+        </w:rPr>
+        <w:t>response[</w:t>
+      </w:r>
+      <w:proofErr w:type="gramEnd"/>
+      <w:r>
+        <w:rPr>
+          <w:b/>
+          <w:bCs/>
+          <w:color w:val="D86DCB" w:themeColor="accent5" w:themeTint="99"/>
+          <w:sz w:val="36"/>
+          <w:szCs w:val="36"/>
+        </w:rPr>
+        <w:t>0].body is the raw JSON string from the API.</w:t>
+      </w:r>
+    </w:p>
+    <w:p>
+      <w:pPr>
+        <w:jc w:val="both"/>
+        <w:rPr>
+          <w:b/>
+          <w:bCs/>
+          <w:color w:val="D86DCB" w:themeColor="accent5" w:themeTint="99"/>
+          <w:sz w:val="36"/>
+          <w:szCs w:val="36"/>
+        </w:rPr>
+      </w:pPr>
+      <w:r>
+        <w:rPr>
+          <w:b/>
+          <w:bCs/>
+          <w:color w:val="D86DCB" w:themeColor="accent5" w:themeTint="99"/>
+          <w:sz w:val="36"/>
+          <w:szCs w:val="36"/>
+        </w:rPr>
+        <w:t xml:space="preserve">        final </w:t>
+      </w:r>
+      <w:proofErr w:type="spellStart"/>
+      <w:r>
+        <w:rPr>
+          <w:b/>
+          <w:bCs/>
+          <w:color w:val="D86DCB" w:themeColor="accent5" w:themeTint="99"/>
+          <w:sz w:val="36"/>
+          <w:szCs w:val="36"/>
+        </w:rPr>
+        <w:t>currentData</w:t>
+      </w:r>
+      <w:proofErr w:type="spellEnd"/>
+      <w:r>
+        <w:rPr>
+          <w:b/>
+          <w:bCs/>
+          <w:color w:val="D86DCB" w:themeColor="accent5" w:themeTint="99"/>
+          <w:sz w:val="36"/>
+          <w:szCs w:val="36"/>
+        </w:rPr>
+        <w:t xml:space="preserve"> = </w:t>
+      </w:r>
+      <w:proofErr w:type="spellStart"/>
+      <w:proofErr w:type="gramStart"/>
+      <w:r>
+        <w:rPr>
+          <w:b/>
+          <w:bCs/>
+          <w:color w:val="D86DCB" w:themeColor="accent5" w:themeTint="99"/>
+          <w:sz w:val="36"/>
+          <w:szCs w:val="36"/>
+        </w:rPr>
+        <w:t>json.decode</w:t>
+      </w:r>
+      <w:proofErr w:type="spellEnd"/>
+      <w:proofErr w:type="gramEnd"/>
+      <w:r>
+        <w:rPr>
+          <w:b/>
+          <w:bCs/>
+          <w:color w:val="D86DCB" w:themeColor="accent5" w:themeTint="99"/>
+          <w:sz w:val="36"/>
+          <w:szCs w:val="36"/>
+        </w:rPr>
+        <w:t>(response[0].body);</w:t>
+      </w:r>
+    </w:p>
+    <w:p>
+      <w:pPr>
+        <w:jc w:val="both"/>
+        <w:rPr>
+          <w:b/>
+          <w:bCs/>
+          <w:color w:val="D86DCB" w:themeColor="accent5" w:themeTint="99"/>
+          <w:sz w:val="36"/>
+          <w:szCs w:val="36"/>
+        </w:rPr>
+      </w:pPr>
+      <w:r>
+        <w:rPr>
+          <w:b/>
+          <w:bCs/>
+          <w:color w:val="D86DCB" w:themeColor="accent5" w:themeTint="99"/>
+          <w:sz w:val="36"/>
+          <w:szCs w:val="36"/>
+        </w:rPr>
+        <w:t xml:space="preserve">        final </w:t>
+      </w:r>
+      <w:proofErr w:type="spellStart"/>
+      <w:r>
+        <w:rPr>
+          <w:b/>
+          <w:bCs/>
+          <w:color w:val="D86DCB" w:themeColor="accent5" w:themeTint="99"/>
+          <w:sz w:val="36"/>
+          <w:szCs w:val="36"/>
+        </w:rPr>
+        <w:t>hourlyData</w:t>
+      </w:r>
+      <w:proofErr w:type="spellEnd"/>
+      <w:r>
+        <w:rPr>
+          <w:b/>
+          <w:bCs/>
+          <w:color w:val="D86DCB" w:themeColor="accent5" w:themeTint="99"/>
+          <w:sz w:val="36"/>
+          <w:szCs w:val="36"/>
+        </w:rPr>
+        <w:t xml:space="preserve"> = </w:t>
+      </w:r>
+      <w:proofErr w:type="spellStart"/>
+      <w:proofErr w:type="gramStart"/>
+      <w:r>
+        <w:rPr>
+          <w:b/>
+          <w:bCs/>
+          <w:color w:val="D86DCB" w:themeColor="accent5" w:themeTint="99"/>
+          <w:sz w:val="36"/>
+          <w:szCs w:val="36"/>
+        </w:rPr>
+        <w:t>json.decode</w:t>
+      </w:r>
+      <w:proofErr w:type="spellEnd"/>
+      <w:proofErr w:type="gramEnd"/>
+      <w:r>
+        <w:rPr>
+          <w:b/>
+          <w:bCs/>
+          <w:color w:val="D86DCB" w:themeColor="accent5" w:themeTint="99"/>
+          <w:sz w:val="36"/>
+          <w:szCs w:val="36"/>
+        </w:rPr>
+        <w:t>(response[1].body);</w:t>
+      </w:r>
+    </w:p>
+    <w:p>
+      <w:pPr>
+        <w:jc w:val="both"/>
+        <w:rPr>
+          <w:b/>
+          <w:bCs/>
+          <w:color w:val="D86DCB" w:themeColor="accent5" w:themeTint="99"/>
+          <w:sz w:val="36"/>
+          <w:szCs w:val="36"/>
+        </w:rPr>
+      </w:pPr>
+      <w:r>
+        <w:rPr>
+          <w:b/>
+          <w:bCs/>
+          <w:color w:val="D86DCB" w:themeColor="accent5" w:themeTint="99"/>
+          <w:sz w:val="36"/>
+          <w:szCs w:val="36"/>
+        </w:rPr>
+        <w:t xml:space="preserve">        final </w:t>
+      </w:r>
+      <w:proofErr w:type="spellStart"/>
+      <w:r>
+        <w:rPr>
+          <w:b/>
+          <w:bCs/>
+          <w:color w:val="D86DCB" w:themeColor="accent5" w:themeTint="99"/>
+          <w:sz w:val="36"/>
+          <w:szCs w:val="36"/>
+        </w:rPr>
+        <w:t>dailyData</w:t>
+      </w:r>
+      <w:proofErr w:type="spellEnd"/>
+      <w:r>
+        <w:rPr>
+          <w:b/>
+          <w:bCs/>
+          <w:color w:val="D86DCB" w:themeColor="accent5" w:themeTint="99"/>
+          <w:sz w:val="36"/>
+          <w:szCs w:val="36"/>
+        </w:rPr>
+        <w:t xml:space="preserve"> = </w:t>
+      </w:r>
+      <w:proofErr w:type="spellStart"/>
+      <w:proofErr w:type="gramStart"/>
+      <w:r>
+        <w:rPr>
+          <w:b/>
+          <w:bCs/>
+          <w:color w:val="D86DCB" w:themeColor="accent5" w:themeTint="99"/>
+          <w:sz w:val="36"/>
+          <w:szCs w:val="36"/>
+        </w:rPr>
+        <w:t>json.decode</w:t>
+      </w:r>
+      <w:proofErr w:type="spellEnd"/>
+      <w:proofErr w:type="gramEnd"/>
+      <w:r>
+        <w:rPr>
+          <w:b/>
+          <w:bCs/>
+          <w:color w:val="D86DCB" w:themeColor="accent5" w:themeTint="99"/>
+          <w:sz w:val="36"/>
+          <w:szCs w:val="36"/>
+        </w:rPr>
+        <w:t>(response[2].body);</w:t>
+      </w:r>
+    </w:p>
+    <w:p>
+      <w:pPr>
+        <w:jc w:val="both"/>
+        <w:rPr>
+          <w:b/>
+          <w:bCs/>
+          <w:color w:val="D86DCB" w:themeColor="accent5" w:themeTint="99"/>
+          <w:sz w:val="36"/>
+          <w:szCs w:val="36"/>
+        </w:rPr>
+      </w:pPr>
+      <w:r>
+        <w:rPr>
+          <w:b/>
+          <w:bCs/>
+          <w:color w:val="D86DCB" w:themeColor="accent5" w:themeTint="99"/>
+          <w:sz w:val="36"/>
+          <w:szCs w:val="36"/>
+        </w:rPr>
+        <w:t xml:space="preserve">        // Merge into one structured object</w:t>
+      </w:r>
+    </w:p>
+    <w:p>
+      <w:pPr>
+        <w:jc w:val="both"/>
+        <w:rPr>
+          <w:b/>
+          <w:bCs/>
+          <w:color w:val="D86DCB" w:themeColor="accent5" w:themeTint="99"/>
+          <w:sz w:val="36"/>
+          <w:szCs w:val="36"/>
+        </w:rPr>
+      </w:pPr>
+      <w:r>
+        <w:rPr>
+          <w:b/>
+          <w:bCs/>
+          <w:color w:val="D86DCB" w:themeColor="accent5" w:themeTint="99"/>
+          <w:sz w:val="36"/>
+          <w:szCs w:val="36"/>
+        </w:rPr>
+        <w:t xml:space="preserve">        final </w:t>
+      </w:r>
+      <w:proofErr w:type="spellStart"/>
+      <w:r>
+        <w:rPr>
+          <w:b/>
+          <w:bCs/>
+          <w:color w:val="D86DCB" w:themeColor="accent5" w:themeTint="99"/>
+          <w:sz w:val="36"/>
+          <w:szCs w:val="36"/>
+        </w:rPr>
+        <w:t>mergedData</w:t>
+      </w:r>
+      <w:proofErr w:type="spellEnd"/>
+      <w:r>
+        <w:rPr>
+          <w:b/>
+          <w:bCs/>
+          <w:color w:val="D86DCB" w:themeColor="accent5" w:themeTint="99"/>
+          <w:sz w:val="36"/>
+          <w:szCs w:val="36"/>
+        </w:rPr>
+        <w:t xml:space="preserve"> = {</w:t>
+      </w:r>
+    </w:p>
+    <w:p>
+      <w:pPr>
+        <w:jc w:val="both"/>
+        <w:rPr>
+          <w:b/>
+          <w:bCs/>
+          <w:color w:val="D86DCB" w:themeColor="accent5" w:themeTint="99"/>
+          <w:sz w:val="36"/>
+          <w:szCs w:val="36"/>
+        </w:rPr>
+      </w:pPr>
+      <w:r>
+        <w:rPr>
+          <w:b/>
+          <w:bCs/>
+          <w:color w:val="D86DCB" w:themeColor="accent5" w:themeTint="99"/>
+          <w:sz w:val="36"/>
+          <w:szCs w:val="36"/>
+        </w:rPr>
+        <w:t xml:space="preserve">          "location": </w:t>
+      </w:r>
+      <w:proofErr w:type="spellStart"/>
+      <w:r>
+        <w:rPr>
+          <w:b/>
+          <w:bCs/>
+          <w:color w:val="D86DCB" w:themeColor="accent5" w:themeTint="99"/>
+          <w:sz w:val="36"/>
+          <w:szCs w:val="36"/>
+        </w:rPr>
+        <w:t>currentData</w:t>
+      </w:r>
+      <w:proofErr w:type="spellEnd"/>
+      <w:r>
+        <w:rPr>
+          <w:b/>
+          <w:bCs/>
+          <w:color w:val="D86DCB" w:themeColor="accent5" w:themeTint="99"/>
+          <w:sz w:val="36"/>
+          <w:szCs w:val="36"/>
+        </w:rPr>
+        <w:t>["name"],</w:t>
+      </w:r>
+    </w:p>
+    <w:p>
+      <w:pPr>
+        <w:jc w:val="both"/>
+        <w:rPr>
+          <w:b/>
+          <w:bCs/>
+          <w:color w:val="D86DCB" w:themeColor="accent5" w:themeTint="99"/>
+          <w:sz w:val="36"/>
+          <w:szCs w:val="36"/>
+        </w:rPr>
+      </w:pPr>
+      <w:r>
+        <w:rPr>
+          <w:b/>
+          <w:bCs/>
+          <w:color w:val="D86DCB" w:themeColor="accent5" w:themeTint="99"/>
+          <w:sz w:val="36"/>
+          <w:szCs w:val="36"/>
+        </w:rPr>
+        <w:t xml:space="preserve">          "coordinates": {</w:t>
+      </w:r>
+    </w:p>
+    <w:p>
+      <w:pPr>
+        <w:jc w:val="both"/>
+        <w:rPr>
+          <w:b/>
+          <w:bCs/>
+          <w:color w:val="D86DCB" w:themeColor="accent5" w:themeTint="99"/>
+          <w:sz w:val="36"/>
+          <w:szCs w:val="36"/>
+        </w:rPr>
+      </w:pPr>
+      <w:r>
+        <w:rPr>
+          <w:b/>
+          <w:bCs/>
+          <w:color w:val="D86DCB" w:themeColor="accent5" w:themeTint="99"/>
+          <w:sz w:val="36"/>
+          <w:szCs w:val="36"/>
+        </w:rPr>
+        <w:t xml:space="preserve">            "</w:t>
+      </w:r>
+      <w:proofErr w:type="spellStart"/>
+      <w:r>
+        <w:rPr>
+          <w:b/>
+          <w:bCs/>
+          <w:color w:val="D86DCB" w:themeColor="accent5" w:themeTint="99"/>
+          <w:sz w:val="36"/>
+          <w:szCs w:val="36"/>
+        </w:rPr>
+        <w:t>lat</w:t>
+      </w:r>
+      <w:proofErr w:type="spellEnd"/>
+      <w:r>
+        <w:rPr>
+          <w:b/>
+          <w:bCs/>
+          <w:color w:val="D86DCB" w:themeColor="accent5" w:themeTint="99"/>
+          <w:sz w:val="36"/>
+          <w:szCs w:val="36"/>
+        </w:rPr>
+        <w:t xml:space="preserve">": </w:t>
+      </w:r>
+      <w:proofErr w:type="spellStart"/>
+      <w:r>
+        <w:rPr>
+          <w:b/>
+          <w:bCs/>
+          <w:color w:val="D86DCB" w:themeColor="accent5" w:themeTint="99"/>
+          <w:sz w:val="36"/>
+          <w:szCs w:val="36"/>
+        </w:rPr>
+        <w:t>lat</w:t>
+      </w:r>
+      <w:proofErr w:type="spellEnd"/>
+      <w:r>
+        <w:rPr>
+          <w:b/>
+          <w:bCs/>
+          <w:color w:val="D86DCB" w:themeColor="accent5" w:themeTint="99"/>
+          <w:sz w:val="36"/>
+          <w:szCs w:val="36"/>
+        </w:rPr>
+        <w:t>,</w:t>
+      </w:r>
+    </w:p>
+    <w:p>
+      <w:pPr>
+        <w:jc w:val="both"/>
+        <w:rPr>
+          <w:b/>
+          <w:bCs/>
+          <w:color w:val="D86DCB" w:themeColor="accent5" w:themeTint="99"/>
+          <w:sz w:val="36"/>
+          <w:szCs w:val="36"/>
+        </w:rPr>
+      </w:pPr>
+      <w:r>
+        <w:rPr>
+          <w:b/>
+          <w:bCs/>
+          <w:color w:val="D86DCB" w:themeColor="accent5" w:themeTint="99"/>
+          <w:sz w:val="36"/>
+          <w:szCs w:val="36"/>
+        </w:rPr>
+        <w:t xml:space="preserve">            "</w:t>
+      </w:r>
+      <w:proofErr w:type="spellStart"/>
+      <w:r>
+        <w:rPr>
+          <w:b/>
+          <w:bCs/>
+          <w:color w:val="D86DCB" w:themeColor="accent5" w:themeTint="99"/>
+          <w:sz w:val="36"/>
+          <w:szCs w:val="36"/>
+        </w:rPr>
+        <w:t>lon</w:t>
+      </w:r>
+      <w:proofErr w:type="spellEnd"/>
+      <w:r>
+        <w:rPr>
+          <w:b/>
+          <w:bCs/>
+          <w:color w:val="D86DCB" w:themeColor="accent5" w:themeTint="99"/>
+          <w:sz w:val="36"/>
+          <w:szCs w:val="36"/>
+        </w:rPr>
+        <w:t xml:space="preserve">": </w:t>
+      </w:r>
+      <w:proofErr w:type="spellStart"/>
+      <w:r>
+        <w:rPr>
+          <w:b/>
+          <w:bCs/>
+          <w:color w:val="D86DCB" w:themeColor="accent5" w:themeTint="99"/>
+          <w:sz w:val="36"/>
+          <w:szCs w:val="36"/>
+        </w:rPr>
+        <w:t>lon</w:t>
+      </w:r>
+      <w:proofErr w:type="spellEnd"/>
+      <w:r>
+        <w:rPr>
+          <w:b/>
+          <w:bCs/>
+          <w:color w:val="D86DCB" w:themeColor="accent5" w:themeTint="99"/>
+          <w:sz w:val="36"/>
+          <w:szCs w:val="36"/>
+        </w:rPr>
+        <w:t>,</w:t>
+      </w:r>
+    </w:p>
+    <w:p>
+      <w:pPr>
+        <w:jc w:val="both"/>
+        <w:rPr>
+          <w:b/>
+          <w:bCs/>
+          <w:color w:val="D86DCB" w:themeColor="accent5" w:themeTint="99"/>
+          <w:sz w:val="36"/>
+          <w:szCs w:val="36"/>
+        </w:rPr>
+      </w:pPr>
+      <w:r>
+        <w:rPr>
+          <w:b/>
+          <w:bCs/>
+          <w:color w:val="D86DCB" w:themeColor="accent5" w:themeTint="99"/>
+          <w:sz w:val="36"/>
+          <w:szCs w:val="36"/>
+        </w:rPr>
+        <w:t xml:space="preserve">          },</w:t>
+      </w:r>
+    </w:p>
+    <w:p>
+      <w:pPr>
+        <w:jc w:val="both"/>
+        <w:rPr>
+          <w:b/>
+          <w:bCs/>
+          <w:color w:val="D86DCB" w:themeColor="accent5" w:themeTint="99"/>
+          <w:sz w:val="36"/>
+          <w:szCs w:val="36"/>
+        </w:rPr>
+      </w:pPr>
+      <w:r>
+        <w:rPr>
+          <w:b/>
+          <w:bCs/>
+          <w:color w:val="D86DCB" w:themeColor="accent5" w:themeTint="99"/>
+          <w:sz w:val="36"/>
+          <w:szCs w:val="36"/>
+        </w:rPr>
+        <w:t xml:space="preserve">          "current": </w:t>
+      </w:r>
+      <w:proofErr w:type="spellStart"/>
+      <w:r>
+        <w:rPr>
+          <w:b/>
+          <w:bCs/>
+          <w:color w:val="D86DCB" w:themeColor="accent5" w:themeTint="99"/>
+          <w:sz w:val="36"/>
+          <w:szCs w:val="36"/>
+        </w:rPr>
+        <w:t>currentData</w:t>
+      </w:r>
+      <w:proofErr w:type="spellEnd"/>
+      <w:r>
+        <w:rPr>
+          <w:b/>
+          <w:bCs/>
+          <w:color w:val="D86DCB" w:themeColor="accent5" w:themeTint="99"/>
+          <w:sz w:val="36"/>
+          <w:szCs w:val="36"/>
+        </w:rPr>
+        <w:t>,</w:t>
+      </w:r>
+    </w:p>
+    <w:p>
+      <w:pPr>
+        <w:jc w:val="both"/>
+        <w:rPr>
+          <w:b/>
+          <w:bCs/>
+          <w:color w:val="D86DCB" w:themeColor="accent5" w:themeTint="99"/>
+          <w:sz w:val="36"/>
+          <w:szCs w:val="36"/>
+        </w:rPr>
+      </w:pPr>
+      <w:r>
+        <w:rPr>
+          <w:b/>
+          <w:bCs/>
+          <w:color w:val="D86DCB" w:themeColor="accent5" w:themeTint="99"/>
+          <w:sz w:val="36"/>
+          <w:szCs w:val="36"/>
+        </w:rPr>
+        <w:t xml:space="preserve">          "hourly": </w:t>
+      </w:r>
+      <w:proofErr w:type="spellStart"/>
+      <w:r>
+        <w:rPr>
+          <w:b/>
+          <w:bCs/>
+          <w:color w:val="D86DCB" w:themeColor="accent5" w:themeTint="99"/>
+          <w:sz w:val="36"/>
+          <w:szCs w:val="36"/>
+        </w:rPr>
+        <w:t>hourlyData</w:t>
+      </w:r>
+      <w:proofErr w:type="spellEnd"/>
+      <w:r>
+        <w:rPr>
+          <w:b/>
+          <w:bCs/>
+          <w:color w:val="D86DCB" w:themeColor="accent5" w:themeTint="99"/>
+          <w:sz w:val="36"/>
+          <w:szCs w:val="36"/>
+        </w:rPr>
+        <w:t>['list'</w:t>
+      </w:r>
+      <w:proofErr w:type="gramStart"/>
+      <w:r>
+        <w:rPr>
+          <w:b/>
+          <w:bCs/>
+          <w:color w:val="D86DCB" w:themeColor="accent5" w:themeTint="99"/>
+          <w:sz w:val="36"/>
+          <w:szCs w:val="36"/>
+        </w:rPr>
+        <w:t>] ??</w:t>
+      </w:r>
+      <w:proofErr w:type="gramEnd"/>
+      <w:r>
+        <w:rPr>
+          <w:b/>
+          <w:bCs/>
+          <w:color w:val="D86DCB" w:themeColor="accent5" w:themeTint="99"/>
+          <w:sz w:val="36"/>
+          <w:szCs w:val="36"/>
+        </w:rPr>
+        <w:t xml:space="preserve"> [],</w:t>
+      </w:r>
+    </w:p>
+    <w:p>
+      <w:pPr>
+        <w:jc w:val="both"/>
+        <w:rPr>
+          <w:b/>
+          <w:bCs/>
+          <w:color w:val="D86DCB" w:themeColor="accent5" w:themeTint="99"/>
+          <w:sz w:val="36"/>
+          <w:szCs w:val="36"/>
+        </w:rPr>
+      </w:pPr>
+      <w:r>
+        <w:rPr>
+          <w:b/>
+          <w:bCs/>
+          <w:color w:val="D86DCB" w:themeColor="accent5" w:themeTint="99"/>
+          <w:sz w:val="36"/>
+          <w:szCs w:val="36"/>
+        </w:rPr>
+        <w:lastRenderedPageBreak/>
+        <w:t xml:space="preserve">          "daily": </w:t>
+      </w:r>
+      <w:proofErr w:type="spellStart"/>
+      <w:r>
+        <w:rPr>
+          <w:b/>
+          <w:bCs/>
+          <w:color w:val="D86DCB" w:themeColor="accent5" w:themeTint="99"/>
+          <w:sz w:val="36"/>
+          <w:szCs w:val="36"/>
+        </w:rPr>
+        <w:t>dailyData</w:t>
+      </w:r>
+      <w:proofErr w:type="spellEnd"/>
+      <w:r>
+        <w:rPr>
+          <w:b/>
+          <w:bCs/>
+          <w:color w:val="D86DCB" w:themeColor="accent5" w:themeTint="99"/>
+          <w:sz w:val="36"/>
+          <w:szCs w:val="36"/>
+        </w:rPr>
+        <w:t>['list'</w:t>
+      </w:r>
+      <w:proofErr w:type="gramStart"/>
+      <w:r>
+        <w:rPr>
+          <w:b/>
+          <w:bCs/>
+          <w:color w:val="D86DCB" w:themeColor="accent5" w:themeTint="99"/>
+          <w:sz w:val="36"/>
+          <w:szCs w:val="36"/>
+        </w:rPr>
+        <w:t>] ??</w:t>
+      </w:r>
+      <w:proofErr w:type="gramEnd"/>
+      <w:r>
+        <w:rPr>
+          <w:b/>
+          <w:bCs/>
+          <w:color w:val="D86DCB" w:themeColor="accent5" w:themeTint="99"/>
+          <w:sz w:val="36"/>
+          <w:szCs w:val="36"/>
+        </w:rPr>
+        <w:t xml:space="preserve"> [],</w:t>
+      </w:r>
+    </w:p>
+    <w:p>
+      <w:pPr>
+        <w:jc w:val="both"/>
+        <w:rPr>
+          <w:b/>
+          <w:bCs/>
+          <w:color w:val="D86DCB" w:themeColor="accent5" w:themeTint="99"/>
+          <w:sz w:val="36"/>
+          <w:szCs w:val="36"/>
+        </w:rPr>
+      </w:pPr>
+      <w:r>
+        <w:rPr>
+          <w:b/>
+          <w:bCs/>
+          <w:color w:val="D86DCB" w:themeColor="accent5" w:themeTint="99"/>
+          <w:sz w:val="36"/>
+          <w:szCs w:val="36"/>
+        </w:rPr>
+        <w:t xml:space="preserve">        };</w:t>
+      </w:r>
+    </w:p>
+    <w:p>
+      <w:pPr>
+        <w:jc w:val="both"/>
+        <w:rPr>
+          <w:b/>
+          <w:bCs/>
+          <w:color w:val="D86DCB" w:themeColor="accent5" w:themeTint="99"/>
+          <w:sz w:val="36"/>
+          <w:szCs w:val="36"/>
+        </w:rPr>
+      </w:pPr>
+      <w:r>
+        <w:rPr>
+          <w:b/>
+          <w:bCs/>
+          <w:color w:val="D86DCB" w:themeColor="accent5" w:themeTint="99"/>
+          <w:sz w:val="36"/>
+          <w:szCs w:val="36"/>
+        </w:rPr>
+        <w:t>…</w:t>
+      </w:r>
     </w:p>
     <w:p>
       <w:pPr>
@@ -45634,6 +47520,7 @@
   <w:style w:type="character" w:default="1" w:styleId="DefaultParagraphFont">
     <w:name w:val="Default Paragraph Font"/>
     <w:uiPriority w:val="1"/>
+    <w:semiHidden/>
     <w:unhideWhenUsed/>
   </w:style>
   <w:style w:type="table" w:default="1" w:styleId="TableNormal">

</xml_diff>